<commit_message>
Comments anchored to text, as in Word
- Read each Word comment's range (commentRangeStart/End, across paragraphs) as its quote
- Highlight the commented words in the editor (theirs yellow, ours pink); click to see the comments
- Their comment cards show the quoted words
- Marked-up copy: our comments on a selection are anchored on those words (runs split as needed)
- Demo files: comments on specific words, and whole-word redlines

Co-Authored-By: Claude Opus 5.5 <noreply@anthropic.com>
</commit_message>
<xml_diff>
--- a/demo/1-our-nda-two-rounds/Brightwater-Mutual-NDA-v1-client-redline.docx
+++ b/demo/1-our-nda-two-rounds/Brightwater-Mutual-NDA-v1-client-redline.docx
@@ -102,7 +102,7 @@
             <w:b w:val="false"/>
             <w:bCs w:val="false"/>
           </w:rPr>
-          <w:delText xml:space="preserve">does not include information tha</w:delText>
+          <w:delText xml:space="preserve">does not include information that:</w:delText>
         </w:r>
       </w:del>
       <w:ins w:id="102" w:author="Brightwater Legal" w:date="2026-10-12T14:30:00Z">
@@ -111,11 +111,11 @@
             <w:b w:val="false"/>
             <w:bCs w:val="false"/>
           </w:rPr>
-          <w:t xml:space="preserve">if i</w:t>
-        </w:r>
-      </w:ins>
-      <w:r>
-        <w:t xml:space="preserve">t: (a) is or becomes public</w:t>
+          <w:t xml:space="preserve">if it:</w:t>
+        </w:r>
+      </w:ins>
+      <w:r>
+        <w:t xml:space="preserve"> (a) is or becomes </w:t>
       </w:r>
       <w:del w:id="103" w:author="Brightwater Legal" w:date="2026-10-12T14:30:00Z">
         <w:r>
@@ -123,7 +123,7 @@
             <w:b w:val="false"/>
             <w:bCs w:val="false"/>
           </w:rPr>
-          <w:delText xml:space="preserve">ly available </w:delText>
+          <w:delText xml:space="preserve">publicly available </w:delText>
         </w:r>
       </w:del>
       <w:ins w:id="104" w:author="Brightwater Legal" w:date="2026-10-12T14:30:00Z">
@@ -132,7 +132,7 @@
             <w:b w:val="false"/>
             <w:bCs w:val="false"/>
           </w:rPr>
-          <w:t xml:space="preserve"> </w:t>
+          <w:t xml:space="preserve">public </w:t>
         </w:r>
       </w:ins>
       <w:r>
@@ -190,7 +190,7 @@
         </w:r>
       </w:ins>
       <w:r>
-        <w:t xml:space="preserve">the Recipient</w:t>
+        <w:t xml:space="preserve">the </w:t>
       </w:r>
       <w:del w:id="110" w:author="Brightwater Legal" w:date="2026-10-12T14:30:00Z">
         <w:r>
@@ -198,7 +198,7 @@
             <w:b w:val="false"/>
             <w:bCs w:val="false"/>
           </w:rPr>
-          <w:delText xml:space="preserve">'s possession before </w:delText>
+          <w:delText xml:space="preserve">Recipient's possession before </w:delText>
         </w:r>
       </w:del>
       <w:ins w:id="111" w:author="Brightwater Legal" w:date="2026-10-12T14:30:00Z">
@@ -207,7 +207,7 @@
             <w:b w:val="false"/>
             <w:bCs w:val="false"/>
           </w:rPr>
-          <w:t xml:space="preserve"> prior to </w:t>
+          <w:t xml:space="preserve">Recipient prior to </w:t>
         </w:r>
       </w:ins>
       <w:r>
@@ -219,7 +219,7 @@
             <w:b w:val="false"/>
             <w:bCs w:val="false"/>
           </w:rPr>
-          <w:delText xml:space="preserve">receiv</w:delText>
+          <w:delText xml:space="preserve">received</w:delText>
         </w:r>
       </w:del>
       <w:ins w:id="113" w:author="Brightwater Legal" w:date="2026-10-12T14:30:00Z">
@@ -228,11 +228,11 @@
             <w:b w:val="false"/>
             <w:bCs w:val="false"/>
           </w:rPr>
-          <w:t xml:space="preserve">obtain</w:t>
-        </w:r>
-      </w:ins>
-      <w:r>
-        <w:t xml:space="preserve">ed from a third party </w:t>
+          <w:t xml:space="preserve">obtained</w:t>
+        </w:r>
+      </w:ins>
+      <w:r>
+        <w:t xml:space="preserve"> from a third party </w:t>
       </w:r>
       <w:del w:id="114" w:author="Brightwater Legal" w:date="2026-10-12T14:30:00Z">
         <w:r>
@@ -240,7 +240,7 @@
             <w:b w:val="false"/>
             <w:bCs w:val="false"/>
           </w:rPr>
-          <w:delText xml:space="preserve">without restriction</w:delText>
+          <w:delText xml:space="preserve">without restriction;</w:delText>
         </w:r>
       </w:del>
       <w:ins w:id="115" w:author="Brightwater Legal" w:date="2026-10-12T14:30:00Z">
@@ -249,11 +249,11 @@
             <w:b w:val="false"/>
             <w:bCs w:val="false"/>
           </w:rPr>
-          <w:t xml:space="preserve">who is free to disclose it</w:t>
-        </w:r>
-      </w:ins>
-      <w:r>
-        <w:t xml:space="preserve">; or (d) is </w:t>
+          <w:t xml:space="preserve">who is free to disclose it;</w:t>
+        </w:r>
+      </w:ins>
+      <w:r>
+        <w:t xml:space="preserve"> or (d) is </w:t>
       </w:r>
       <w:ins w:id="116" w:author="Brightwater Legal" w:date="2026-10-12T14:30:00Z">
         <w:r>
@@ -323,30 +323,39 @@
         <w:spacing w:after="120"/>
         <w:jc w:val="both"/>
       </w:pPr>
+      <w:r>
+        <w:rPr>
+          <w:b/>
+          <w:bCs/>
+        </w:rPr>
+        <w:t xml:space="preserve">2.1 </w:t>
+      </w:r>
+      <w:r>
+        <w:t xml:space="preserve">The Recipient shall: (a) keep the Discloser's Confidential Information confidential; (b) use it only for the Purpose; and (c) not disclose it to any person except its </w:t>
+      </w:r>
       <w:commentRangeStart w:id="1"/>
-      <w:r>
-        <w:rPr>
-          <w:b/>
-          <w:bCs/>
-        </w:rPr>
-        <w:t xml:space="preserve">2.1 </w:t>
-      </w:r>
-      <w:r>
-        <w:t xml:space="preserve">The Recipient shall: (a) keep the Discloser's Confidential Information confidential; (b) use it only for the Purpose; and (c) not disclose it to any person except its </w:t>
-      </w:r>
       <w:ins w:id="120" w:author="Brightwater Legal" w:date="2026-10-12T14:30:00Z">
         <w:r>
           <w:rPr>
             <w:b w:val="false"/>
             <w:bCs w:val="false"/>
           </w:rPr>
-          <w:t xml:space="preserve">and its Affiliates' </w:t>
+          <w:t xml:space="preserve">and its Affiliates'</w:t>
+        </w:r>
+      </w:ins>
+      <w:commentRangeEnd w:id="1"/>
+      <w:ins w:id="121" w:author="Brightwater Legal" w:date="2026-10-12T14:30:00Z">
+        <w:r>
+          <w:rPr>
+            <w:b w:val="false"/>
+            <w:bCs w:val="false"/>
+          </w:rPr>
+          <w:t xml:space="preserve"> </w:t>
         </w:r>
       </w:ins>
       <w:r>
         <w:t xml:space="preserve">employees, officers, professional advisers and subcontractors who need to know it for the Purpose and who are bound by confidentiality obligations no less protective than those in this Agreement.</w:t>
       </w:r>
-      <w:commentRangeEnd w:id="1"/>
       <w:r>
         <w:commentReference w:id="1"/>
       </w:r>
@@ -388,8 +397,7 @@
         <w:spacing w:after="120"/>
         <w:jc w:val="both"/>
       </w:pPr>
-      <w:commentRangeStart w:id="2"/>
-      <w:ins w:id="121" w:author="Brightwater Legal" w:date="2026-10-12T14:30:00Z">
+      <w:ins w:id="122" w:author="Brightwater Legal" w:date="2026-10-12T14:30:00Z">
         <w:r>
           <w:rPr>
             <w:b/>
@@ -398,16 +406,35 @@
           <w:t xml:space="preserve">2.4 </w:t>
         </w:r>
       </w:ins>
-      <w:ins w:id="122" w:author="Brightwater Legal" w:date="2026-10-12T14:30:00Z">
-        <w:r>
-          <w:rPr>
-            <w:b w:val="false"/>
-            <w:bCs w:val="false"/>
-          </w:rPr>
-          <w:t xml:space="preserve">Notwithstanding clause 2.1, either party shall be free to use for any purpose the Residuals resulting from access to or work with the Confidential Information of the other party. "Residuals" means information in non-tangible form which may be retained in the unaided memory of persons who have had access to the Confidential Information.</w:t>
+      <w:ins w:id="123" w:author="Brightwater Legal" w:date="2026-10-12T14:30:00Z">
+        <w:r>
+          <w:rPr>
+            <w:b w:val="false"/>
+            <w:bCs w:val="false"/>
+          </w:rPr>
+          <w:t xml:space="preserve">Notwithstanding clause 2.1, either party shall be </w:t>
+        </w:r>
+      </w:ins>
+      <w:commentRangeStart w:id="2"/>
+      <w:ins w:id="124" w:author="Brightwater Legal" w:date="2026-10-12T14:30:00Z">
+        <w:r>
+          <w:rPr>
+            <w:b w:val="false"/>
+            <w:bCs w:val="false"/>
+          </w:rPr>
+          <w:t xml:space="preserve">free to use for any purpose the Residuals</w:t>
         </w:r>
       </w:ins>
       <w:commentRangeEnd w:id="2"/>
+      <w:ins w:id="125" w:author="Brightwater Legal" w:date="2026-10-12T14:30:00Z">
+        <w:r>
+          <w:rPr>
+            <w:b w:val="false"/>
+            <w:bCs w:val="false"/>
+          </w:rPr>
+          <w:t xml:space="preserve"> resulting from access to or work with the Confidential Information of the other party. "Residuals" means information in non-tangible form which may be retained in the unaided memory of persons who have had access to the Confidential Information.</w:t>
+        </w:r>
+      </w:ins>
       <w:r>
         <w:commentReference w:id="2"/>
       </w:r>
@@ -462,7 +489,7 @@
         <w:spacing w:after="120"/>
         <w:jc w:val="both"/>
       </w:pPr>
-      <w:del w:id="123" w:author="Brightwater Legal" w:date="2026-10-12T14:30:00Z">
+      <w:del w:id="126" w:author="Brightwater Legal" w:date="2026-10-12T14:30:00Z">
         <w:r>
           <w:rPr>
             <w:b/>
@@ -471,7 +498,7 @@
           <w:delText xml:space="preserve">3.3 </w:delText>
         </w:r>
       </w:del>
-      <w:del w:id="124" w:author="Brightwater Legal" w:date="2026-10-12T14:30:00Z">
+      <w:del w:id="127" w:author="Brightwater Legal" w:date="2026-10-12T14:30:00Z">
         <w:r>
           <w:rPr>
             <w:b w:val="false"/>
@@ -499,39 +526,42 @@
         <w:spacing w:after="120"/>
         <w:jc w:val="both"/>
       </w:pPr>
+      <w:r>
+        <w:rPr>
+          <w:b/>
+          <w:bCs/>
+        </w:rPr>
+        <w:t xml:space="preserve">4.1 </w:t>
+      </w:r>
+      <w:r>
+        <w:t xml:space="preserve">This Agreement starts on the date of last signature and continues for two (2) years. The obligations in this Agreement shall continue for </w:t>
+      </w:r>
+      <w:del w:id="128" w:author="Brightwater Legal" w:date="2026-10-12T14:30:00Z">
+        <w:r>
+          <w:rPr>
+            <w:b w:val="false"/>
+            <w:bCs w:val="false"/>
+          </w:rPr>
+          <w:delText xml:space="preserve">three (3)</w:delText>
+        </w:r>
+      </w:del>
       <w:commentRangeStart w:id="3"/>
-      <w:r>
-        <w:rPr>
-          <w:b/>
-          <w:bCs/>
-        </w:rPr>
-        <w:t xml:space="preserve">4.1 </w:t>
-      </w:r>
-      <w:r>
-        <w:t xml:space="preserve">This Agreement starts on the date of last signature and continues for two (2) years. The obligations in this Agreement shall continue for </w:t>
-      </w:r>
-      <w:del w:id="125" w:author="Brightwater Legal" w:date="2026-10-12T14:30:00Z">
-        <w:r>
-          <w:rPr>
-            <w:b w:val="false"/>
-            <w:bCs w:val="false"/>
-          </w:rPr>
-          <w:delText xml:space="preserve">three (3</w:delText>
-        </w:r>
-      </w:del>
-      <w:ins w:id="126" w:author="Brightwater Legal" w:date="2026-10-12T14:30:00Z">
-        <w:r>
-          <w:rPr>
-            <w:b w:val="false"/>
-            <w:bCs w:val="false"/>
-          </w:rPr>
-          <w:t xml:space="preserve">five (5</w:t>
-        </w:r>
-      </w:ins>
-      <w:r>
-        <w:t xml:space="preserve">) years from the date of termination or expiry, except in relation to trade secrets, which shall be protected for as long as they remain trade secrets.</w:t>
+      <w:ins w:id="129" w:author="Brightwater Legal" w:date="2026-10-12T14:30:00Z">
+        <w:r>
+          <w:rPr>
+            <w:b w:val="false"/>
+            <w:bCs w:val="false"/>
+          </w:rPr>
+          <w:t xml:space="preserve">five (5)</w:t>
+        </w:r>
+      </w:ins>
+      <w:r>
+        <w:t xml:space="preserve"> years</w:t>
       </w:r>
       <w:commentRangeEnd w:id="3"/>
+      <w:r>
+        <w:t xml:space="preserve"> from the date of termination or expiry, except in relation to trade secrets, which shall be protected for as long as they remain trade secrets.</w:t>
+      </w:r>
       <w:r>
         <w:commentReference w:id="3"/>
       </w:r>
@@ -666,95 +696,48 @@
         <w:spacing w:after="120"/>
         <w:jc w:val="both"/>
       </w:pPr>
+      <w:r>
+        <w:rPr>
+          <w:b/>
+          <w:bCs/>
+        </w:rPr>
+        <w:t xml:space="preserve">5.8 </w:t>
+      </w:r>
+      <w:r>
+        <w:t xml:space="preserve">This Agreement and any dispute or claim arising out of or in connection with it shall be governed by </w:t>
+      </w:r>
       <w:commentRangeStart w:id="4"/>
       <w:r>
-        <w:rPr>
-          <w:b/>
-          <w:bCs/>
-        </w:rPr>
-        <w:t xml:space="preserve">5.8 </w:t>
-      </w:r>
-      <w:r>
-        <w:t xml:space="preserve">This Agreement and any dispute or claim arising out of or in connection with it shall be governed by the law</w:t>
-      </w:r>
-      <w:del w:id="127" w:author="Brightwater Legal" w:date="2026-10-12T14:30:00Z">
-        <w:r>
-          <w:rPr>
-            <w:b w:val="false"/>
-            <w:bCs w:val="false"/>
-          </w:rPr>
-          <w:delText xml:space="preserve"> </w:delText>
+        <w:t xml:space="preserve">the </w:t>
+      </w:r>
+      <w:del w:id="130" w:author="Brightwater Legal" w:date="2026-10-12T14:30:00Z">
+        <w:r>
+          <w:rPr>
+            <w:b w:val="false"/>
+            <w:bCs w:val="false"/>
+          </w:rPr>
+          <w:delText xml:space="preserve">law </w:delText>
         </w:r>
       </w:del>
-      <w:ins w:id="128" w:author="Brightwater Legal" w:date="2026-10-12T14:30:00Z">
-        <w:r>
-          <w:rPr>
-            <w:b w:val="false"/>
-            <w:bCs w:val="false"/>
-          </w:rPr>
-          <w:t xml:space="preserve">s of the State </w:t>
+      <w:ins w:id="131" w:author="Brightwater Legal" w:date="2026-10-12T14:30:00Z">
+        <w:r>
+          <w:rPr>
+            <w:b w:val="false"/>
+            <w:bCs w:val="false"/>
+          </w:rPr>
+          <w:t xml:space="preserve">laws of the State </w:t>
         </w:r>
       </w:ins>
       <w:r>
         <w:t xml:space="preserve">of </w:t>
       </w:r>
-      <w:del w:id="129" w:author="Brightwater Legal" w:date="2026-10-12T14:30:00Z">
+      <w:del w:id="132" w:author="Brightwater Legal" w:date="2026-10-12T14:30:00Z">
         <w:r>
           <w:rPr>
             <w:b w:val="false"/>
             <w:bCs w:val="false"/>
           </w:rPr>
           <w:delText xml:space="preserve">England and Wales.</w:delText>
-        </w:r>
-      </w:del>
-      <w:ins w:id="130" w:author="Brightwater Legal" w:date="2026-10-12T14:30:00Z">
-        <w:r>
-          <w:rPr>
-            <w:b w:val="false"/>
-            <w:bCs w:val="false"/>
-          </w:rPr>
-          <w:t xml:space="preserve">New York.</w:t>
-        </w:r>
-      </w:ins>
-      <w:commentRangeEnd w:id="4"/>
-      <w:r>
-        <w:commentReference w:id="4"/>
-      </w:r>
-    </w:p>
-    <w:p>
-      <w:pPr>
-        <w:spacing w:after="120"/>
-        <w:jc w:val="both"/>
-      </w:pPr>
-      <w:r>
-        <w:rPr>
-          <w:b/>
-          <w:bCs/>
-        </w:rPr>
-        <w:t xml:space="preserve">5.9 </w:t>
-      </w:r>
-      <w:r>
-        <w:t xml:space="preserve">The </w:t>
-      </w:r>
-      <w:ins w:id="131" w:author="Brightwater Legal" w:date="2026-10-12T14:30:00Z">
-        <w:r>
-          <w:rPr>
-            <w:b w:val="false"/>
-            <w:bCs w:val="false"/>
-          </w:rPr>
-          <w:t xml:space="preserve">state and federal </w:t>
-        </w:r>
-      </w:ins>
-      <w:r>
-        <w:t xml:space="preserve">courts </w:t>
-      </w:r>
-      <w:del w:id="132" w:author="Brightwater Legal" w:date="2026-10-12T14:30:00Z">
-        <w:r>
-          <w:rPr>
-            <w:b w:val="false"/>
-            <w:bCs w:val="false"/>
-          </w:rPr>
-          <w:delText xml:space="preserve">of England and Wales </w:delText>
         </w:r>
       </w:del>
       <w:ins w:id="133" w:author="Brightwater Legal" w:date="2026-10-12T14:30:00Z">
@@ -763,6 +746,65 @@
             <w:b w:val="false"/>
             <w:bCs w:val="false"/>
           </w:rPr>
+          <w:t xml:space="preserve">New York</w:t>
+        </w:r>
+      </w:ins>
+      <w:commentRangeEnd w:id="4"/>
+      <w:ins w:id="134" w:author="Brightwater Legal" w:date="2026-10-12T14:30:00Z">
+        <w:r>
+          <w:rPr>
+            <w:b w:val="false"/>
+            <w:bCs w:val="false"/>
+          </w:rPr>
+          <w:t xml:space="preserve">.</w:t>
+        </w:r>
+      </w:ins>
+      <w:r>
+        <w:commentReference w:id="4"/>
+      </w:r>
+    </w:p>
+    <w:p>
+      <w:pPr>
+        <w:spacing w:after="120"/>
+        <w:jc w:val="both"/>
+      </w:pPr>
+      <w:r>
+        <w:rPr>
+          <w:b/>
+          <w:bCs/>
+        </w:rPr>
+        <w:t xml:space="preserve">5.9 </w:t>
+      </w:r>
+      <w:r>
+        <w:t xml:space="preserve">The </w:t>
+      </w:r>
+      <w:ins w:id="135" w:author="Brightwater Legal" w:date="2026-10-12T14:30:00Z">
+        <w:r>
+          <w:rPr>
+            <w:b w:val="false"/>
+            <w:bCs w:val="false"/>
+          </w:rPr>
+          <w:t xml:space="preserve">state and federal </w:t>
+        </w:r>
+      </w:ins>
+      <w:r>
+        <w:t xml:space="preserve">courts </w:t>
+      </w:r>
+      <w:del w:id="136" w:author="Brightwater Legal" w:date="2026-10-12T14:30:00Z">
+        <w:r>
+          <w:rPr>
+            <w:b w:val="false"/>
+            <w:bCs w:val="false"/>
+          </w:rPr>
+          <w:delText xml:space="preserve">of England and Wales </w:delText>
+        </w:r>
+      </w:del>
+      <w:ins w:id="137" w:author="Brightwater Legal" w:date="2026-10-12T14:30:00Z">
+        <w:r>
+          <w:rPr>
+            <w:b w:val="false"/>
+            <w:bCs w:val="false"/>
+          </w:rPr>
           <w:t xml:space="preserve">located in New York County, New York </w:t>
         </w:r>
       </w:ins>
@@ -775,7 +817,7 @@
         <w:spacing w:after="120"/>
         <w:jc w:val="both"/>
       </w:pPr>
-      <w:ins w:id="134" w:author="Brightwater Legal" w:date="2026-10-12T14:30:00Z">
+      <w:ins w:id="138" w:author="Brightwater Legal" w:date="2026-10-12T14:30:00Z">
         <w:r>
           <w:rPr>
             <w:b/>
@@ -784,7 +826,7 @@
           <w:t xml:space="preserve">5.10 </w:t>
         </w:r>
       </w:ins>
-      <w:ins w:id="135" w:author="Brightwater Legal" w:date="2026-10-12T14:30:00Z">
+      <w:ins w:id="139" w:author="Brightwater Legal" w:date="2026-10-12T14:30:00Z">
         <w:r>
           <w:rPr>
             <w:b w:val="false"/>

</xml_diff>